<commit_message>
Update Ferragro backend/frontend features and production docs
Align API, frontend behavior, CI/workflows, and operational documentation for the latest production deployment cycle.

Co-authored-by: Cursor <cursoragent@cursor.com>
</commit_message>
<xml_diff>
--- a/docs/CUMPLIMIENTO_REQ.docx
+++ b/docs/CUMPLIMIENTO_REQ.docx
@@ -23,7 +23,7 @@
         <w:pStyle w:val="Heading1"/>
       </w:pPr>
       <w:r>
-        <w:t>Estado general (mayo 2026)</w:t>
+        <w:t>Estado general (26 mayo 2026)</w:t>
       </w:r>
     </w:p>
     <w:tbl>
@@ -138,7 +138,7 @@
               <w:spacing w:after="0"/>
             </w:pPr>
             <w:r>
-              <w:t>Roles Admin / Logística / Proveedor</w:t>
+              <w:t>Roles Admin / Logística / Proveedor / Admin bodega</w:t>
             </w:r>
           </w:p>
         </w:tc>
@@ -164,7 +164,7 @@
               <w:spacing w:after="0"/>
             </w:pPr>
             <w:r>
-              <w:t>Panel por rol</w:t>
+              <w:t>Panel por rol, 020_admin_bodega.sql</w:t>
             </w:r>
           </w:p>
         </w:tc>
@@ -261,7 +261,7 @@
               <w:spacing w:after="0"/>
             </w:pPr>
             <w:r>
-              <w:t>Franjas por bodega y fecha</w:t>
+              <w:t>Franjas por bodega, muelle y fecha</w:t>
             </w:r>
           </w:p>
         </w:tc>
@@ -328,7 +328,7 @@
               <w:spacing w:after="0"/>
             </w:pPr>
             <w:r>
-              <w:t>/health → email_enabled</w:t>
+              <w:t>/health → email_enabled, SMTP_PROFILE</w:t>
             </w:r>
           </w:p>
         </w:tc>
@@ -343,7 +343,7 @@
               <w:spacing w:after="0"/>
             </w:pPr>
             <w:r>
-              <w:t>Auditoría historial</w:t>
+              <w:t>Cierre automático no presentada</w:t>
             </w:r>
           </w:p>
         </w:tc>
@@ -369,7 +369,89 @@
               <w:spacing w:after="0"/>
             </w:pPr>
             <w:r>
-              <w:t>Triggers 002, tablas historial</w:t>
+              <w:t>no_presentada_scheduler.py, 15 min configurable</w:t>
+            </w:r>
+          </w:p>
+        </w:tc>
+      </w:tr>
+      <w:tr>
+        <w:tc>
+          <w:tcPr>
+            <w:tcW w:type="dxa" w:w="2880"/>
+          </w:tcPr>
+          <w:p>
+            <w:pPr>
+              <w:spacing w:after="0"/>
+            </w:pPr>
+            <w:r>
+              <w:t>Auditoría historial (+ admin bodega)</w:t>
+            </w:r>
+          </w:p>
+        </w:tc>
+        <w:tc>
+          <w:tcPr>
+            <w:tcW w:type="dxa" w:w="2880"/>
+          </w:tcPr>
+          <w:p>
+            <w:pPr>
+              <w:spacing w:after="0"/>
+            </w:pPr>
+            <w:r>
+              <w:t>Implementado</w:t>
+            </w:r>
+          </w:p>
+        </w:tc>
+        <w:tc>
+          <w:tcPr>
+            <w:tcW w:type="dxa" w:w="2880"/>
+          </w:tcPr>
+          <w:p>
+            <w:pPr>
+              <w:spacing w:after="0"/>
+            </w:pPr>
+            <w:r>
+              <w:t>Triggers 002, STAFF_AUDIT_ROLES</w:t>
+            </w:r>
+          </w:p>
+        </w:tc>
+      </w:tr>
+      <w:tr>
+        <w:tc>
+          <w:tcPr>
+            <w:tcW w:type="dxa" w:w="2880"/>
+          </w:tcPr>
+          <w:p>
+            <w:pPr>
+              <w:spacing w:after="0"/>
+            </w:pPr>
+            <w:r>
+              <w:t>Analítica por día (zona Bogotá)</w:t>
+            </w:r>
+          </w:p>
+        </w:tc>
+        <w:tc>
+          <w:tcPr>
+            <w:tcW w:type="dxa" w:w="2880"/>
+          </w:tcPr>
+          <w:p>
+            <w:pPr>
+              <w:spacing w:after="0"/>
+            </w:pPr>
+            <w:r>
+              <w:t>Implementado</w:t>
+            </w:r>
+          </w:p>
+        </w:tc>
+        <w:tc>
+          <w:tcPr>
+            <w:tcW w:type="dxa" w:w="2880"/>
+          </w:tcPr>
+          <w:p>
+            <w:pPr>
+              <w:spacing w:after="0"/>
+            </w:pPr>
+            <w:r>
+              <w:t>GET /crud/analytics/summary, tests timezone</w:t>
             </w:r>
           </w:p>
         </w:tc>
@@ -425,7 +507,7 @@
               <w:spacing w:after="0"/>
             </w:pPr>
             <w:r>
-              <w:t>Pruebas automatizadas BD</w:t>
+              <w:t>Pruebas automatizadas</w:t>
             </w:r>
           </w:p>
         </w:tc>
@@ -438,7 +520,7 @@
               <w:spacing w:after="0"/>
             </w:pPr>
             <w:r>
-              <w:t>Implementado</w:t>
+              <w:t>85 tests pytest</w:t>
             </w:r>
           </w:p>
         </w:tc>
@@ -451,48 +533,7 @@
               <w:spacing w:after="0"/>
             </w:pPr>
             <w:r>
-              <w:t>test_db_crud_functions.py (12 tests)</w:t>
-            </w:r>
-          </w:p>
-        </w:tc>
-      </w:tr>
-      <w:tr>
-        <w:tc>
-          <w:tcPr>
-            <w:tcW w:type="dxa" w:w="2880"/>
-          </w:tcPr>
-          <w:p>
-            <w:pPr>
-              <w:spacing w:after="0"/>
-            </w:pPr>
-            <w:r>
-              <w:t>Pruebas reglas logística</w:t>
-            </w:r>
-          </w:p>
-        </w:tc>
-        <w:tc>
-          <w:tcPr>
-            <w:tcW w:type="dxa" w:w="2880"/>
-          </w:tcPr>
-          <w:p>
-            <w:pPr>
-              <w:spacing w:after="0"/>
-            </w:pPr>
-            <w:r>
-              <w:t>Implementado</w:t>
-            </w:r>
-          </w:p>
-        </w:tc>
-        <w:tc>
-          <w:tcPr>
-            <w:tcW w:type="dxa" w:w="2880"/>
-          </w:tcPr>
-          <w:p>
-            <w:pPr>
-              <w:spacing w:after="0"/>
-            </w:pPr>
-            <w:r>
-              <w:t>test_logistics_business_rules.py</w:t>
+              <w:t>Ver [PRUEBAS.md](PRUEBAS.md)</w:t>
             </w:r>
           </w:p>
         </w:tc>
@@ -520,7 +561,7 @@
               <w:spacing w:after="0"/>
             </w:pPr>
             <w:r>
-              <w:t>Pendiente</w:t>
+              <w:t>Implementado</w:t>
             </w:r>
           </w:p>
         </w:tc>
@@ -533,7 +574,7 @@
               <w:spacing w:after="0"/>
             </w:pPr>
             <w:r>
-              <w:t>Recomendado workflow pytest + build</w:t>
+              <w:t>.github/workflows/ci.yml (sin BD + PostgreSQL + build Vite)</w:t>
             </w:r>
           </w:p>
         </w:tc>
@@ -561,7 +602,7 @@
         <w:spacing w:after="120"/>
       </w:pPr>
       <w:r>
-        <w:t>2. RNF rendimiento: índices 015, listado por semana, available-slots unificado (ver ESCALABILIDAD.md).</w:t>
+        <w:t>2. RF ventana de finalización: alerta y auto no_presentada tras gracia configurable.</w:t>
       </w:r>
     </w:p>
     <w:p>
@@ -569,7 +610,23 @@
         <w:spacing w:after="120"/>
       </w:pPr>
       <w:r>
-        <w:t>3. RNF disponibilidad: /health con build_id y flags SMTP.</w:t>
+        <w:t>3. RF notificaciones: campana, correo con dedupe, purga por retención.</w:t>
+      </w:r>
+    </w:p>
+    <w:p>
+      <w:pPr>
+        <w:spacing w:after="120"/>
+      </w:pPr>
+      <w:r>
+        <w:t>4. RNF rendimiento: índices 015, listado por semana, available-slots unificado (ver ESCALABILIDAD.md).</w:t>
+      </w:r>
+    </w:p>
+    <w:p>
+      <w:pPr>
+        <w:spacing w:after="120"/>
+      </w:pPr>
+      <w:r>
+        <w:t>5. RNF disponibilidad: /health con build_id y flags SMTP.</w:t>
       </w:r>
     </w:p>
     <w:p>
@@ -736,6 +793,34 @@
           </w:p>
         </w:tc>
       </w:tr>
+      <w:tr>
+        <w:tc>
+          <w:tcPr>
+            <w:tcW w:type="dxa" w:w="4320"/>
+          </w:tcPr>
+          <w:p>
+            <w:pPr>
+              <w:spacing w:after="0"/>
+            </w:pPr>
+            <w:r>
+              <w:t>Manual Word con capturas</w:t>
+            </w:r>
+          </w:p>
+        </w:tc>
+        <w:tc>
+          <w:tcPr>
+            <w:tcW w:type="dxa" w:w="4320"/>
+          </w:tcPr>
+          <w:p>
+            <w:pPr>
+              <w:spacing w:after="0"/>
+            </w:pPr>
+            <w:r>
+              <w:t>Pendiente capturas en MANUAL_USUARIO_Y_DOCUMENTACION.docx (ver MANUAL_USUARIO_PORTAL.md)</w:t>
+            </w:r>
+          </w:p>
+        </w:tc>
+      </w:tr>
     </w:tbl>
     <w:p/>
     <w:p>
@@ -786,7 +871,7 @@
         <w:rPr>
           <w:i/>
         </w:rPr>
-        <w:t>Última actualización: mayo 2026.</w:t>
+        <w:t>Última actualización: 26 mayo 2026.</w:t>
       </w:r>
     </w:p>
     <w:sectPr>

</xml_diff>